<commit_message>
update assignment 10 report
</commit_message>
<xml_diff>
--- a/assignment10/How the System Works.docx
+++ b/assignment10/How the System Works.docx
@@ -168,7 +168,25 @@
           <w:kern w:val="0"/>
           <w14:ligatures w14:val="none"/>
         </w:rPr>
-        <w:t xml:space="preserve">The assignment asked for artificial delays so race windows are visible: after each successful replicate RPC the coordinator sleeps 200 </w:t>
+        <w:t xml:space="preserve">The assignment asked for artificial </w:t>
+      </w:r>
+      <w:proofErr w:type="gramStart"/>
+      <w:r>
+        <w:rPr>
+          <w:rFonts w:eastAsia="Times New Roman" w:cstheme="minorHAnsi"/>
+          <w:kern w:val="0"/>
+          <w14:ligatures w14:val="none"/>
+        </w:rPr>
+        <w:t>delays</w:t>
+      </w:r>
+      <w:proofErr w:type="gramEnd"/>
+      <w:r>
+        <w:rPr>
+          <w:rFonts w:eastAsia="Times New Roman" w:cstheme="minorHAnsi"/>
+          <w:kern w:val="0"/>
+          <w14:ligatures w14:val="none"/>
+        </w:rPr>
+        <w:t xml:space="preserve"> so race windows are visible: after each successful replicate RPC the coordinator sleeps 200 </w:t>
       </w:r>
       <w:proofErr w:type="spellStart"/>
       <w:r>
@@ -375,10 +393,20 @@
       <w:r>
         <w:rPr>
           <w:rFonts w:eastAsia="Times New Roman" w:cstheme="minorHAnsi"/>
-          <w:kern w:val="0"/>
-          <w14:ligatures w14:val="none"/>
-        </w:rPr>
-        <w:t>Follower (leader–follower): We reject client writes with 403. The design assumes the load generator sends writes only to the leader.</w:t>
+          <w:b/>
+          <w:bCs/>
+          <w:kern w:val="0"/>
+          <w14:ligatures w14:val="none"/>
+        </w:rPr>
+        <w:t>Follower (leader–follower):</w:t>
+      </w:r>
+      <w:r>
+        <w:rPr>
+          <w:rFonts w:eastAsia="Times New Roman" w:cstheme="minorHAnsi"/>
+          <w:kern w:val="0"/>
+          <w14:ligatures w14:val="none"/>
+        </w:rPr>
+        <w:t> We reject client writes with 403. The design assumes the load generator sends writes only to the leader.</w:t>
       </w:r>
     </w:p>
     <w:p>
@@ -393,12 +421,23 @@
       <w:r>
         <w:rPr>
           <w:rFonts w:eastAsia="Times New Roman" w:cstheme="minorHAnsi"/>
-          <w:kern w:val="0"/>
-          <w14:ligatures w14:val="none"/>
-        </w:rPr>
-        <w:t>Leader (leader–follower): We allocate a new version with </w:t>
-      </w:r>
-      <w:proofErr w:type="spellStart"/>
+          <w:b/>
+          <w:bCs/>
+          <w:kern w:val="0"/>
+          <w14:ligatures w14:val="none"/>
+        </w:rPr>
+        <w:t>Leader (leader–follower):</w:t>
+      </w:r>
+      <w:r>
+        <w:rPr>
+          <w:rFonts w:eastAsia="Times New Roman" w:cstheme="minorHAnsi"/>
+          <w:kern w:val="0"/>
+          <w14:ligatures w14:val="none"/>
+        </w:rPr>
+        <w:t> We allocate a new version with </w:t>
+      </w:r>
+      <w:proofErr w:type="spellStart"/>
+      <w:proofErr w:type="gramStart"/>
       <w:r>
         <w:rPr>
           <w:rFonts w:eastAsia="Times New Roman" w:cstheme="minorHAnsi"/>
@@ -414,7 +453,16 @@
           <w:kern w:val="0"/>
           <w14:ligatures w14:val="none"/>
         </w:rPr>
-        <w:t>() (a monotonic counter on that leader), then </w:t>
+        <w:t>(</w:t>
+      </w:r>
+      <w:proofErr w:type="gramEnd"/>
+      <w:r>
+        <w:rPr>
+          <w:rFonts w:eastAsia="Times New Roman" w:cstheme="minorHAnsi"/>
+          <w:kern w:val="0"/>
+          <w14:ligatures w14:val="none"/>
+        </w:rPr>
+        <w:t>) (a monotonic counter on that leader), then </w:t>
       </w:r>
       <w:proofErr w:type="spellStart"/>
       <w:r>
@@ -454,7 +502,25 @@
           <w:kern w:val="0"/>
           <w14:ligatures w14:val="none"/>
         </w:rPr>
-        <w:t xml:space="preserve">W ≥ N (e.g. W=5, N=5): We call each follower in KV_PEER_URLS in order, POST /internal/replicate with {key, value, version}. If any call fails, we return 502 and the client sees no success—though the leader already holds the new value (we do not roll </w:t>
+        <w:t>W ≥ N (</w:t>
+      </w:r>
+      <w:proofErr w:type="gramStart"/>
+      <w:r>
+        <w:rPr>
+          <w:rFonts w:eastAsia="Times New Roman" w:cstheme="minorHAnsi"/>
+          <w:kern w:val="0"/>
+          <w14:ligatures w14:val="none"/>
+        </w:rPr>
+        <w:t>e.g.</w:t>
+      </w:r>
+      <w:proofErr w:type="gramEnd"/>
+      <w:r>
+        <w:rPr>
+          <w:rFonts w:eastAsia="Times New Roman" w:cstheme="minorHAnsi"/>
+          <w:kern w:val="0"/>
+          <w14:ligatures w14:val="none"/>
+        </w:rPr>
+        <w:t xml:space="preserve"> W=5, N=5): We call each follower in KV_PEER_URLS in order, POST /internal/replicate with {key, value, version}. If any call fails, we return 502 and the client sees no success—though the leader already holds the new value (we do not roll </w:t>
       </w:r>
       <w:r>
         <w:rPr>
@@ -463,7 +529,25 @@
           <w14:ligatures w14:val="none"/>
         </w:rPr>
         <w:lastRenderedPageBreak/>
-        <w:t xml:space="preserve">back; this is a known trade-off for a class project). After each successful follower response we sleep 200 </w:t>
+        <w:t xml:space="preserve">back; this is a known trade-off for a class project). After each successful follower </w:t>
+      </w:r>
+      <w:proofErr w:type="gramStart"/>
+      <w:r>
+        <w:rPr>
+          <w:rFonts w:eastAsia="Times New Roman" w:cstheme="minorHAnsi"/>
+          <w:kern w:val="0"/>
+          <w14:ligatures w14:val="none"/>
+        </w:rPr>
+        <w:t>response</w:t>
+      </w:r>
+      <w:proofErr w:type="gramEnd"/>
+      <w:r>
+        <w:rPr>
+          <w:rFonts w:eastAsia="Times New Roman" w:cstheme="minorHAnsi"/>
+          <w:kern w:val="0"/>
+          <w14:ligatures w14:val="none"/>
+        </w:rPr>
+        <w:t xml:space="preserve"> we sleep 200 </w:t>
       </w:r>
       <w:proofErr w:type="spellStart"/>
       <w:r>
@@ -543,7 +627,25 @@
           <w:kern w:val="0"/>
           <w14:ligatures w14:val="none"/>
         </w:rPr>
-        <w:t xml:space="preserve">Otherwise (quorum, e.g. W=3): We replicate to followers in parallel. The leader already counts as one vote; we need W−1 successful follower ACKs. If we do not get enough, we return 502. Each successful RPC still triggers the 200 </w:t>
+        <w:t xml:space="preserve">Otherwise (quorum, </w:t>
+      </w:r>
+      <w:proofErr w:type="gramStart"/>
+      <w:r>
+        <w:rPr>
+          <w:rFonts w:eastAsia="Times New Roman" w:cstheme="minorHAnsi"/>
+          <w:kern w:val="0"/>
+          <w14:ligatures w14:val="none"/>
+        </w:rPr>
+        <w:t>e.g.</w:t>
+      </w:r>
+      <w:proofErr w:type="gramEnd"/>
+      <w:r>
+        <w:rPr>
+          <w:rFonts w:eastAsia="Times New Roman" w:cstheme="minorHAnsi"/>
+          <w:kern w:val="0"/>
+          <w14:ligatures w14:val="none"/>
+        </w:rPr>
+        <w:t xml:space="preserve"> W=3): We replicate to followers in parallel. The leader already counts as one vote; we need W−1 successful follower ACKs. If we do not get enough, we return 502. Each successful RPC still triggers the 200 </w:t>
       </w:r>
       <w:proofErr w:type="spellStart"/>
       <w:r>
@@ -630,10 +732,20 @@
       <w:r>
         <w:rPr>
           <w:rFonts w:eastAsia="Times New Roman" w:cstheme="minorHAnsi"/>
-          <w:kern w:val="0"/>
-          <w14:ligatures w14:val="none"/>
-        </w:rPr>
-        <w:t>Leaderless: Any node may accept POST /set. That node becomes the write coordinator. We compute a version with a </w:t>
+          <w:b/>
+          <w:bCs/>
+          <w:kern w:val="0"/>
+          <w14:ligatures w14:val="none"/>
+        </w:rPr>
+        <w:t>Leaderless:</w:t>
+      </w:r>
+      <w:r>
+        <w:rPr>
+          <w:rFonts w:eastAsia="Times New Roman" w:cstheme="minorHAnsi"/>
+          <w:kern w:val="0"/>
+          <w14:ligatures w14:val="none"/>
+        </w:rPr>
+        <w:t> Any node may accept POST /set. That node becomes the write coordinator. We compute a version with a </w:t>
       </w:r>
       <w:proofErr w:type="spellStart"/>
       <w:r>
@@ -882,7 +994,25 @@
           <w:kern w:val="0"/>
           <w14:ligatures w14:val="none"/>
         </w:rPr>
-        <w:t xml:space="preserve"> matches a URL, we read locally; otherwise we call GET /internal/read on that peer. The leader answers /internal/read without the 50 </w:t>
+        <w:t xml:space="preserve"> matches a URL, we read locally; </w:t>
+      </w:r>
+      <w:proofErr w:type="gramStart"/>
+      <w:r>
+        <w:rPr>
+          <w:rFonts w:eastAsia="Times New Roman" w:cstheme="minorHAnsi"/>
+          <w:kern w:val="0"/>
+          <w14:ligatures w14:val="none"/>
+        </w:rPr>
+        <w:t>otherwise</w:t>
+      </w:r>
+      <w:proofErr w:type="gramEnd"/>
+      <w:r>
+        <w:rPr>
+          <w:rFonts w:eastAsia="Times New Roman" w:cstheme="minorHAnsi"/>
+          <w:kern w:val="0"/>
+          <w14:ligatures w14:val="none"/>
+        </w:rPr>
+        <w:t xml:space="preserve"> we call GET /internal/read on that peer. The leader answers /internal/read without the 50 </w:t>
       </w:r>
       <w:proofErr w:type="spellStart"/>
       <w:r>
@@ -941,17 +1071,7 @@
           <w:kern w:val="0"/>
           <w14:ligatures w14:val="none"/>
         </w:rPr>
-        <w:t xml:space="preserve">5. </w:t>
-      </w:r>
-      <w:r>
-        <w:rPr>
-          <w:rFonts w:eastAsia="Times New Roman" w:cstheme="minorHAnsi"/>
-          <w:b/>
-          <w:bCs/>
-          <w:kern w:val="0"/>
-          <w14:ligatures w14:val="none"/>
-        </w:rPr>
-        <w:t>Tricky parts and error handling</w:t>
+        <w:t>5. Tricky parts and error handling</w:t>
       </w:r>
     </w:p>
     <w:p>
@@ -1120,9 +1240,19 @@
           <w:kern w:val="0"/>
           <w14:ligatures w14:val="none"/>
         </w:rPr>
-        <w:t>consistency_test.go</w:t>
-      </w:r>
-      <w:proofErr w:type="spellEnd"/>
+        <w:t>consistency_</w:t>
+      </w:r>
+      <w:proofErr w:type="gramStart"/>
+      <w:r>
+        <w:rPr>
+          <w:rFonts w:eastAsia="Times New Roman" w:cstheme="minorHAnsi"/>
+          <w:kern w:val="0"/>
+          <w14:ligatures w14:val="none"/>
+        </w:rPr>
+        <w:t>test.go</w:t>
+      </w:r>
+      <w:proofErr w:type="spellEnd"/>
+      <w:proofErr w:type="gramEnd"/>
       <w:r>
         <w:rPr>
           <w:rFonts w:eastAsia="Times New Roman" w:cstheme="minorHAnsi"/>
@@ -1162,61 +1292,448 @@
           <w:kern w:val="0"/>
           <w14:ligatures w14:val="none"/>
         </w:rPr>
-        <w:t xml:space="preserve">Python load generator </w:t>
-      </w:r>
-    </w:p>
-    <w:p>
-      <w:pPr>
-        <w:spacing w:before="90" w:after="90"/>
-        <w:rPr>
-          <w:rFonts w:eastAsia="Times New Roman" w:cstheme="minorHAnsi"/>
-          <w:kern w:val="0"/>
-          <w14:ligatures w14:val="none"/>
-        </w:rPr>
-      </w:pPr>
-      <w:r>
-        <w:rPr>
-          <w:rFonts w:eastAsia="Times New Roman" w:cstheme="minorHAnsi"/>
-          <w:kern w:val="0"/>
-          <w14:ligatures w14:val="none"/>
-        </w:rPr>
-        <w:t>scripts/loadtest.py uses </w:t>
-      </w:r>
-      <w:proofErr w:type="spellStart"/>
-      <w:r>
-        <w:rPr>
-          <w:rFonts w:eastAsia="Times New Roman" w:cstheme="minorHAnsi"/>
-          <w:kern w:val="0"/>
-          <w14:ligatures w14:val="none"/>
-        </w:rPr>
-        <w:t>asyncio</w:t>
-      </w:r>
-      <w:proofErr w:type="spellEnd"/>
-      <w:r>
-        <w:rPr>
-          <w:rFonts w:eastAsia="Times New Roman" w:cstheme="minorHAnsi"/>
-          <w:kern w:val="0"/>
-          <w14:ligatures w14:val="none"/>
-        </w:rPr>
-        <w:t xml:space="preserve"> + </w:t>
-      </w:r>
-      <w:proofErr w:type="spellStart"/>
-      <w:r>
-        <w:rPr>
-          <w:rFonts w:eastAsia="Times New Roman" w:cstheme="minorHAnsi"/>
-          <w:kern w:val="0"/>
-          <w14:ligatures w14:val="none"/>
-        </w:rPr>
-        <w:t>httpx</w:t>
-      </w:r>
-      <w:proofErr w:type="spellEnd"/>
-      <w:r>
-        <w:rPr>
-          <w:rFonts w:eastAsia="Times New Roman" w:cstheme="minorHAnsi"/>
-          <w:kern w:val="0"/>
-          <w14:ligatures w14:val="none"/>
-        </w:rPr>
-        <w:t> with a semaphore for concurrency. It keeps a small key pool (k0..k_{K-1}) so reads and writes often hit the same keys close in time (“local-in-time”), which makes stale reads and tail latency visible. It logs each request’s latency, version, and a stale flag into JSONL; plot_results.py draws histograms and CDFs for the report.</w:t>
+        <w:t xml:space="preserve">Testing </w:t>
+      </w:r>
+      <w:r>
+        <w:rPr>
+          <w:rFonts w:eastAsia="Times New Roman" w:cstheme="minorHAnsi" w:hint="eastAsia"/>
+          <w:b/>
+          <w:bCs/>
+          <w:kern w:val="0"/>
+          <w14:ligatures w14:val="none"/>
+        </w:rPr>
+        <w:t>Con</w:t>
+      </w:r>
+      <w:r>
+        <w:rPr>
+          <w:rFonts w:eastAsia="Times New Roman" w:cstheme="minorHAnsi"/>
+          <w:b/>
+          <w:bCs/>
+          <w:kern w:val="0"/>
+          <w14:ligatures w14:val="none"/>
+        </w:rPr>
+        <w:t xml:space="preserve">sistency </w:t>
+      </w:r>
+    </w:p>
+    <w:p>
+      <w:pPr>
+        <w:pStyle w:val="NormalWeb"/>
+        <w:spacing w:before="90" w:beforeAutospacing="0" w:after="90" w:afterAutospacing="0"/>
+        <w:rPr>
+          <w:rFonts w:asciiTheme="minorHAnsi" w:hAnsiTheme="minorHAnsi" w:cstheme="minorHAnsi"/>
+        </w:rPr>
+      </w:pPr>
+      <w:r>
+        <w:rPr>
+          <w:rFonts w:asciiTheme="minorHAnsi" w:hAnsiTheme="minorHAnsi" w:cstheme="minorHAnsi"/>
+        </w:rPr>
+        <w:t>I</w:t>
+      </w:r>
+      <w:r>
+        <w:rPr>
+          <w:rFonts w:asciiTheme="minorHAnsi" w:hAnsiTheme="minorHAnsi" w:cstheme="minorHAnsi"/>
+        </w:rPr>
+        <w:t xml:space="preserve"> added GET /</w:t>
+      </w:r>
+      <w:proofErr w:type="spellStart"/>
+      <w:r>
+        <w:rPr>
+          <w:rFonts w:asciiTheme="minorHAnsi" w:hAnsiTheme="minorHAnsi" w:cstheme="minorHAnsi"/>
+          <w:b/>
+          <w:bCs/>
+        </w:rPr>
+        <w:t>local_read</w:t>
+      </w:r>
+      <w:proofErr w:type="spellEnd"/>
+      <w:r>
+        <w:rPr>
+          <w:rFonts w:asciiTheme="minorHAnsi" w:hAnsiTheme="minorHAnsi" w:cstheme="minorHAnsi"/>
+          <w:b/>
+          <w:bCs/>
+        </w:rPr>
+        <w:t>,</w:t>
+      </w:r>
+      <w:r>
+        <w:rPr>
+          <w:rFonts w:asciiTheme="minorHAnsi" w:hAnsiTheme="minorHAnsi" w:cstheme="minorHAnsi"/>
+        </w:rPr>
+        <w:t xml:space="preserve"> which returns only the local key–value state on that node, so we can see replica lag during replication. Normal GET /get still reflects what a client would see (</w:t>
+      </w:r>
+      <w:proofErr w:type="gramStart"/>
+      <w:r>
+        <w:rPr>
+          <w:rFonts w:asciiTheme="minorHAnsi" w:hAnsiTheme="minorHAnsi" w:cstheme="minorHAnsi"/>
+        </w:rPr>
+        <w:t>e.g.</w:t>
+      </w:r>
+      <w:proofErr w:type="gramEnd"/>
+      <w:r>
+        <w:rPr>
+          <w:rFonts w:asciiTheme="minorHAnsi" w:hAnsiTheme="minorHAnsi" w:cstheme="minorHAnsi"/>
+        </w:rPr>
+        <w:t xml:space="preserve"> follower R=1 reads go through the leader).</w:t>
+      </w:r>
+    </w:p>
+    <w:p>
+      <w:pPr>
+        <w:pStyle w:val="NormalWeb"/>
+        <w:spacing w:before="90" w:beforeAutospacing="0" w:after="90" w:afterAutospacing="0"/>
+        <w:rPr>
+          <w:rFonts w:asciiTheme="minorHAnsi" w:hAnsiTheme="minorHAnsi" w:cstheme="minorHAnsi"/>
+        </w:rPr>
+      </w:pPr>
+      <w:r>
+        <w:rPr>
+          <w:rFonts w:asciiTheme="minorHAnsi" w:hAnsiTheme="minorHAnsi" w:cstheme="minorHAnsi"/>
+          <w:noProof/>
+          <w14:ligatures w14:val="standardContextual"/>
+        </w:rPr>
+        <w:drawing>
+          <wp:inline distT="0" distB="0" distL="0" distR="0" wp14:anchorId="318D882F" wp14:editId="027F91F3">
+            <wp:extent cx="4254500" cy="1375440"/>
+            <wp:effectExtent l="0" t="0" r="0" b="0"/>
+            <wp:docPr id="592641785" name="Picture 1" descr="A computer screen shot of a program code&#10;&#10;Description automatically generated"/>
+            <wp:cNvGraphicFramePr>
+              <a:graphicFrameLocks xmlns:a="http://schemas.openxmlformats.org/drawingml/2006/main" noChangeAspect="1"/>
+            </wp:cNvGraphicFramePr>
+            <a:graphic xmlns:a="http://schemas.openxmlformats.org/drawingml/2006/main">
+              <a:graphicData uri="http://schemas.openxmlformats.org/drawingml/2006/picture">
+                <pic:pic xmlns:pic="http://schemas.openxmlformats.org/drawingml/2006/picture">
+                  <pic:nvPicPr>
+                    <pic:cNvPr id="592641785" name="Picture 1" descr="A computer screen shot of a program code&#10;&#10;Description automatically generated"/>
+                    <pic:cNvPicPr/>
+                  </pic:nvPicPr>
+                  <pic:blipFill>
+                    <a:blip r:embed="rId5" cstate="print">
+                      <a:extLst>
+                        <a:ext uri="{28A0092B-C50C-407E-A947-70E740481C1C}">
+                          <a14:useLocalDpi xmlns:a14="http://schemas.microsoft.com/office/drawing/2010/main" val="0"/>
+                        </a:ext>
+                      </a:extLst>
+                    </a:blip>
+                    <a:stretch>
+                      <a:fillRect/>
+                    </a:stretch>
+                  </pic:blipFill>
+                  <pic:spPr>
+                    <a:xfrm>
+                      <a:off x="0" y="0"/>
+                      <a:ext cx="4289364" cy="1386711"/>
+                    </a:xfrm>
+                    <a:prstGeom prst="rect">
+                      <a:avLst/>
+                    </a:prstGeom>
+                  </pic:spPr>
+                </pic:pic>
+              </a:graphicData>
+            </a:graphic>
+          </wp:inline>
+        </w:drawing>
+      </w:r>
+    </w:p>
+    <w:p>
+      <w:pPr>
+        <w:pStyle w:val="NormalWeb"/>
+        <w:spacing w:before="90" w:beforeAutospacing="0" w:after="90" w:afterAutospacing="0"/>
+        <w:rPr>
+          <w:rFonts w:asciiTheme="minorHAnsi" w:hAnsiTheme="minorHAnsi" w:cstheme="minorHAnsi"/>
+        </w:rPr>
+      </w:pPr>
+      <w:r>
+        <w:rPr>
+          <w:rFonts w:asciiTheme="minorHAnsi" w:hAnsiTheme="minorHAnsi" w:cstheme="minorHAnsi"/>
+          <w:b/>
+          <w:bCs/>
+        </w:rPr>
+        <w:t>Leader–Follower:</w:t>
+      </w:r>
+      <w:r>
+        <w:rPr>
+          <w:rFonts w:asciiTheme="minorHAnsi" w:hAnsiTheme="minorHAnsi" w:cstheme="minorHAnsi"/>
+        </w:rPr>
+        <w:t> Unit tests in </w:t>
+      </w:r>
+      <w:proofErr w:type="spellStart"/>
+      <w:r>
+        <w:rPr>
+          <w:rFonts w:asciiTheme="minorHAnsi" w:hAnsiTheme="minorHAnsi" w:cstheme="minorHAnsi"/>
+        </w:rPr>
+        <w:t>consistency_</w:t>
+      </w:r>
+      <w:proofErr w:type="gramStart"/>
+      <w:r>
+        <w:rPr>
+          <w:rFonts w:asciiTheme="minorHAnsi" w:hAnsiTheme="minorHAnsi" w:cstheme="minorHAnsi"/>
+        </w:rPr>
+        <w:t>test.go</w:t>
+      </w:r>
+      <w:proofErr w:type="spellEnd"/>
+      <w:proofErr w:type="gramEnd"/>
+      <w:r>
+        <w:rPr>
+          <w:rFonts w:asciiTheme="minorHAnsi" w:hAnsiTheme="minorHAnsi" w:cstheme="minorHAnsi"/>
+        </w:rPr>
+        <w:t> spin up a small leader–follower pair with </w:t>
+      </w:r>
+      <w:proofErr w:type="spellStart"/>
+      <w:r>
+        <w:rPr>
+          <w:rFonts w:asciiTheme="minorHAnsi" w:hAnsiTheme="minorHAnsi" w:cstheme="minorHAnsi"/>
+        </w:rPr>
+        <w:t>httptest</w:t>
+      </w:r>
+      <w:proofErr w:type="spellEnd"/>
+      <w:r>
+        <w:rPr>
+          <w:rFonts w:asciiTheme="minorHAnsi" w:hAnsiTheme="minorHAnsi" w:cstheme="minorHAnsi"/>
+        </w:rPr>
+        <w:t>. After a leader write completes, reads via /get are consistent. In parallel with an in-flight write, /</w:t>
+      </w:r>
+      <w:proofErr w:type="spellStart"/>
+      <w:r>
+        <w:rPr>
+          <w:rFonts w:asciiTheme="minorHAnsi" w:hAnsiTheme="minorHAnsi" w:cstheme="minorHAnsi"/>
+        </w:rPr>
+        <w:t>local_read</w:t>
+      </w:r>
+      <w:proofErr w:type="spellEnd"/>
+      <w:r>
+        <w:rPr>
+          <w:rFonts w:asciiTheme="minorHAnsi" w:hAnsiTheme="minorHAnsi" w:cstheme="minorHAnsi"/>
+        </w:rPr>
+        <w:t> on a follower may show stale local state until replication finishes; after the write returns, /</w:t>
+      </w:r>
+      <w:proofErr w:type="spellStart"/>
+      <w:r>
+        <w:rPr>
+          <w:rFonts w:asciiTheme="minorHAnsi" w:hAnsiTheme="minorHAnsi" w:cstheme="minorHAnsi"/>
+        </w:rPr>
+        <w:t>local_read</w:t>
+      </w:r>
+      <w:proofErr w:type="spellEnd"/>
+      <w:r>
+        <w:rPr>
+          <w:rFonts w:asciiTheme="minorHAnsi" w:hAnsiTheme="minorHAnsi" w:cstheme="minorHAnsi"/>
+        </w:rPr>
+        <w:t> matches.</w:t>
+      </w:r>
+    </w:p>
+    <w:p>
+      <w:pPr>
+        <w:pStyle w:val="NormalWeb"/>
+        <w:spacing w:before="90" w:beforeAutospacing="0" w:after="90" w:afterAutospacing="0"/>
+        <w:rPr>
+          <w:rFonts w:asciiTheme="minorHAnsi" w:hAnsiTheme="minorHAnsi" w:cstheme="minorHAnsi"/>
+        </w:rPr>
+      </w:pPr>
+      <w:r>
+        <w:rPr>
+          <w:rFonts w:asciiTheme="minorHAnsi" w:hAnsiTheme="minorHAnsi" w:cstheme="minorHAnsi"/>
+          <w:noProof/>
+          <w14:ligatures w14:val="standardContextual"/>
+        </w:rPr>
+        <w:drawing>
+          <wp:inline distT="0" distB="0" distL="0" distR="0" wp14:anchorId="36F66209" wp14:editId="3C2C171D">
+            <wp:extent cx="4464050" cy="1143674"/>
+            <wp:effectExtent l="0" t="0" r="0" b="0"/>
+            <wp:docPr id="1073965159" name="Picture 2" descr="A screen shot of a computer program&#10;&#10;Description automatically generated"/>
+            <wp:cNvGraphicFramePr>
+              <a:graphicFrameLocks xmlns:a="http://schemas.openxmlformats.org/drawingml/2006/main" noChangeAspect="1"/>
+            </wp:cNvGraphicFramePr>
+            <a:graphic xmlns:a="http://schemas.openxmlformats.org/drawingml/2006/main">
+              <a:graphicData uri="http://schemas.openxmlformats.org/drawingml/2006/picture">
+                <pic:pic xmlns:pic="http://schemas.openxmlformats.org/drawingml/2006/picture">
+                  <pic:nvPicPr>
+                    <pic:cNvPr id="1073965159" name="Picture 2" descr="A screen shot of a computer program&#10;&#10;Description automatically generated"/>
+                    <pic:cNvPicPr/>
+                  </pic:nvPicPr>
+                  <pic:blipFill>
+                    <a:blip r:embed="rId6" cstate="print">
+                      <a:extLst>
+                        <a:ext uri="{28A0092B-C50C-407E-A947-70E740481C1C}">
+                          <a14:useLocalDpi xmlns:a14="http://schemas.microsoft.com/office/drawing/2010/main" val="0"/>
+                        </a:ext>
+                      </a:extLst>
+                    </a:blip>
+                    <a:stretch>
+                      <a:fillRect/>
+                    </a:stretch>
+                  </pic:blipFill>
+                  <pic:spPr>
+                    <a:xfrm>
+                      <a:off x="0" y="0"/>
+                      <a:ext cx="4532691" cy="1161260"/>
+                    </a:xfrm>
+                    <a:prstGeom prst="rect">
+                      <a:avLst/>
+                    </a:prstGeom>
+                  </pic:spPr>
+                </pic:pic>
+              </a:graphicData>
+            </a:graphic>
+          </wp:inline>
+        </w:drawing>
+      </w:r>
+    </w:p>
+    <w:p>
+      <w:pPr>
+        <w:pStyle w:val="NormalWeb"/>
+        <w:spacing w:before="90" w:beforeAutospacing="0" w:after="90" w:afterAutospacing="0"/>
+        <w:rPr>
+          <w:rFonts w:asciiTheme="minorHAnsi" w:hAnsiTheme="minorHAnsi" w:cstheme="minorHAnsi"/>
+        </w:rPr>
+      </w:pPr>
+      <w:r>
+        <w:rPr>
+          <w:rFonts w:asciiTheme="minorHAnsi" w:hAnsiTheme="minorHAnsi" w:cstheme="minorHAnsi"/>
+          <w:b/>
+          <w:bCs/>
+        </w:rPr>
+        <w:t>Leaderless:</w:t>
+      </w:r>
+      <w:r>
+        <w:rPr>
+          <w:rFonts w:asciiTheme="minorHAnsi" w:hAnsiTheme="minorHAnsi" w:cstheme="minorHAnsi"/>
+        </w:rPr>
+        <w:t> Two nodes are tested; the write coordinator is chosen at random. While a write is still propagating, GET on the other node may be stale; after the write succeeds, both nodes return the new value.</w:t>
+      </w:r>
+    </w:p>
+    <w:p>
+      <w:pPr>
+        <w:pStyle w:val="NormalWeb"/>
+        <w:spacing w:before="90" w:beforeAutospacing="0" w:after="90" w:afterAutospacing="0"/>
+        <w:rPr>
+          <w:rFonts w:asciiTheme="minorHAnsi" w:hAnsiTheme="minorHAnsi" w:cstheme="minorHAnsi"/>
+        </w:rPr>
+      </w:pPr>
+      <w:r>
+        <w:rPr>
+          <w:rFonts w:asciiTheme="minorHAnsi" w:hAnsiTheme="minorHAnsi" w:cstheme="minorHAnsi"/>
+          <w:noProof/>
+          <w14:ligatures w14:val="standardContextual"/>
+        </w:rPr>
+        <w:drawing>
+          <wp:inline distT="0" distB="0" distL="0" distR="0" wp14:anchorId="32C310D3" wp14:editId="112B10B1">
+            <wp:extent cx="4591050" cy="1309626"/>
+            <wp:effectExtent l="0" t="0" r="0" b="0"/>
+            <wp:docPr id="1291618145" name="Picture 3" descr="A computer screen shot of a number of text&#10;&#10;Description automatically generated with medium confidence"/>
+            <wp:cNvGraphicFramePr>
+              <a:graphicFrameLocks xmlns:a="http://schemas.openxmlformats.org/drawingml/2006/main" noChangeAspect="1"/>
+            </wp:cNvGraphicFramePr>
+            <a:graphic xmlns:a="http://schemas.openxmlformats.org/drawingml/2006/main">
+              <a:graphicData uri="http://schemas.openxmlformats.org/drawingml/2006/picture">
+                <pic:pic xmlns:pic="http://schemas.openxmlformats.org/drawingml/2006/picture">
+                  <pic:nvPicPr>
+                    <pic:cNvPr id="1291618145" name="Picture 3" descr="A computer screen shot of a number of text&#10;&#10;Description automatically generated with medium confidence"/>
+                    <pic:cNvPicPr/>
+                  </pic:nvPicPr>
+                  <pic:blipFill>
+                    <a:blip r:embed="rId7" cstate="print">
+                      <a:extLst>
+                        <a:ext uri="{28A0092B-C50C-407E-A947-70E740481C1C}">
+                          <a14:useLocalDpi xmlns:a14="http://schemas.microsoft.com/office/drawing/2010/main" val="0"/>
+                        </a:ext>
+                      </a:extLst>
+                    </a:blip>
+                    <a:stretch>
+                      <a:fillRect/>
+                    </a:stretch>
+                  </pic:blipFill>
+                  <pic:spPr>
+                    <a:xfrm>
+                      <a:off x="0" y="0"/>
+                      <a:ext cx="4635626" cy="1322341"/>
+                    </a:xfrm>
+                    <a:prstGeom prst="rect">
+                      <a:avLst/>
+                    </a:prstGeom>
+                  </pic:spPr>
+                </pic:pic>
+              </a:graphicData>
+            </a:graphic>
+          </wp:inline>
+        </w:drawing>
+      </w:r>
+    </w:p>
+    <w:p>
+      <w:pPr>
+        <w:pStyle w:val="NormalWeb"/>
+        <w:spacing w:before="90" w:beforeAutospacing="0" w:after="90" w:afterAutospacing="0"/>
+        <w:rPr>
+          <w:rFonts w:asciiTheme="minorHAnsi" w:hAnsiTheme="minorHAnsi" w:cstheme="minorHAnsi"/>
+        </w:rPr>
+      </w:pPr>
+      <w:proofErr w:type="gramStart"/>
+      <w:r>
+        <w:rPr>
+          <w:rFonts w:asciiTheme="minorHAnsi" w:hAnsiTheme="minorHAnsi" w:cstheme="minorHAnsi"/>
+        </w:rPr>
+        <w:lastRenderedPageBreak/>
+        <w:t>All of</w:t>
+      </w:r>
+      <w:proofErr w:type="gramEnd"/>
+      <w:r>
+        <w:rPr>
+          <w:rFonts w:asciiTheme="minorHAnsi" w:hAnsiTheme="minorHAnsi" w:cstheme="minorHAnsi"/>
+        </w:rPr>
+        <w:t xml:space="preserve"> these tests are run with go test and pass. Timing-dependent checks may occasionally skip observing a race on a fast machine; final consistency is always asserted.</w:t>
+      </w:r>
+    </w:p>
+    <w:p>
+      <w:pPr>
+        <w:pStyle w:val="NormalWeb"/>
+        <w:spacing w:before="90" w:beforeAutospacing="0" w:after="90" w:afterAutospacing="0"/>
+        <w:rPr>
+          <w:rFonts w:asciiTheme="minorHAnsi" w:hAnsiTheme="minorHAnsi" w:cstheme="minorHAnsi"/>
+        </w:rPr>
+      </w:pPr>
+      <w:r>
+        <w:rPr>
+          <w:rFonts w:asciiTheme="minorHAnsi" w:hAnsiTheme="minorHAnsi" w:cstheme="minorHAnsi"/>
+          <w:noProof/>
+          <w14:ligatures w14:val="standardContextual"/>
+        </w:rPr>
+        <w:drawing>
+          <wp:inline distT="0" distB="0" distL="0" distR="0" wp14:anchorId="62A9722D" wp14:editId="1C01EE98">
+            <wp:extent cx="4813300" cy="1257320"/>
+            <wp:effectExtent l="0" t="0" r="0" b="0"/>
+            <wp:docPr id="117656299" name="Picture 4" descr="A screen shot of a computer&#10;&#10;Description automatically generated"/>
+            <wp:cNvGraphicFramePr>
+              <a:graphicFrameLocks xmlns:a="http://schemas.openxmlformats.org/drawingml/2006/main" noChangeAspect="1"/>
+            </wp:cNvGraphicFramePr>
+            <a:graphic xmlns:a="http://schemas.openxmlformats.org/drawingml/2006/main">
+              <a:graphicData uri="http://schemas.openxmlformats.org/drawingml/2006/picture">
+                <pic:pic xmlns:pic="http://schemas.openxmlformats.org/drawingml/2006/picture">
+                  <pic:nvPicPr>
+                    <pic:cNvPr id="117656299" name="Picture 4" descr="A screen shot of a computer&#10;&#10;Description automatically generated"/>
+                    <pic:cNvPicPr/>
+                  </pic:nvPicPr>
+                  <pic:blipFill>
+                    <a:blip r:embed="rId8" cstate="print">
+                      <a:extLst>
+                        <a:ext uri="{28A0092B-C50C-407E-A947-70E740481C1C}">
+                          <a14:useLocalDpi xmlns:a14="http://schemas.microsoft.com/office/drawing/2010/main" val="0"/>
+                        </a:ext>
+                      </a:extLst>
+                    </a:blip>
+                    <a:stretch>
+                      <a:fillRect/>
+                    </a:stretch>
+                  </pic:blipFill>
+                  <pic:spPr>
+                    <a:xfrm>
+                      <a:off x="0" y="0"/>
+                      <a:ext cx="4859442" cy="1269373"/>
+                    </a:xfrm>
+                    <a:prstGeom prst="rect">
+                      <a:avLst/>
+                    </a:prstGeom>
+                  </pic:spPr>
+                </pic:pic>
+              </a:graphicData>
+            </a:graphic>
+          </wp:inline>
+        </w:drawing>
       </w:r>
     </w:p>
     <w:p>
@@ -1239,7 +1756,7 @@
           <w:kern w:val="0"/>
           <w14:ligatures w14:val="none"/>
         </w:rPr>
-        <w:t xml:space="preserve">7. </w:t>
+        <w:t>7. Load Testing</w:t>
       </w:r>
       <w:r>
         <w:rPr>
@@ -1249,208 +1766,111 @@
           <w:kern w:val="0"/>
           <w14:ligatures w14:val="none"/>
         </w:rPr>
-        <w:t>What I would tell a friend maintaining this</w:t>
-      </w:r>
-    </w:p>
-    <w:p>
-      <w:pPr>
-        <w:numPr>
-          <w:ilvl w:val="0"/>
-          <w:numId w:val="3"/>
-        </w:numPr>
+        <w:t xml:space="preserve"> </w:t>
+      </w:r>
+    </w:p>
+    <w:p>
+      <w:pPr>
+        <w:spacing w:before="90" w:after="90"/>
+        <w:rPr>
+          <w:rFonts w:eastAsia="Times New Roman" w:cstheme="minorHAnsi"/>
+          <w:kern w:val="0"/>
+          <w14:ligatures w14:val="none"/>
+        </w:rPr>
+      </w:pPr>
+      <w:r>
+        <w:rPr>
+          <w:rFonts w:eastAsia="Times New Roman" w:cstheme="minorHAnsi"/>
+          <w:kern w:val="0"/>
+          <w14:ligatures w14:val="none"/>
+        </w:rPr>
+        <w:t>scripts/loadtest.py uses </w:t>
+      </w:r>
+      <w:proofErr w:type="spellStart"/>
+      <w:r>
+        <w:rPr>
+          <w:rFonts w:eastAsia="Times New Roman" w:cstheme="minorHAnsi"/>
+          <w:kern w:val="0"/>
+          <w14:ligatures w14:val="none"/>
+        </w:rPr>
+        <w:t>asyncio</w:t>
+      </w:r>
+      <w:proofErr w:type="spellEnd"/>
+      <w:r>
+        <w:rPr>
+          <w:rFonts w:eastAsia="Times New Roman" w:cstheme="minorHAnsi"/>
+          <w:kern w:val="0"/>
+          <w14:ligatures w14:val="none"/>
+        </w:rPr>
+        <w:t xml:space="preserve"> + </w:t>
+      </w:r>
+      <w:proofErr w:type="spellStart"/>
+      <w:r>
+        <w:rPr>
+          <w:rFonts w:eastAsia="Times New Roman" w:cstheme="minorHAnsi"/>
+          <w:kern w:val="0"/>
+          <w14:ligatures w14:val="none"/>
+        </w:rPr>
+        <w:t>httpx</w:t>
+      </w:r>
+      <w:proofErr w:type="spellEnd"/>
+      <w:r>
+        <w:rPr>
+          <w:rFonts w:eastAsia="Times New Roman" w:cstheme="minorHAnsi"/>
+          <w:kern w:val="0"/>
+          <w14:ligatures w14:val="none"/>
+        </w:rPr>
+        <w:t> with a semaphore for concurrency. It keeps a small key pool (k</w:t>
+      </w:r>
+      <w:proofErr w:type="gramStart"/>
+      <w:r>
+        <w:rPr>
+          <w:rFonts w:eastAsia="Times New Roman" w:cstheme="minorHAnsi"/>
+          <w:kern w:val="0"/>
+          <w14:ligatures w14:val="none"/>
+        </w:rPr>
+        <w:t>0..</w:t>
+      </w:r>
+      <w:proofErr w:type="gramEnd"/>
+      <w:r>
+        <w:rPr>
+          <w:rFonts w:eastAsia="Times New Roman" w:cstheme="minorHAnsi"/>
+          <w:kern w:val="0"/>
+          <w14:ligatures w14:val="none"/>
+        </w:rPr>
+        <w:t>k_{K-1}) so reads and writes often hit the same keys close in time (“local-in-time”), which makes stale reads and tail latency visible. It logs each request’s latency, version, and a stale flag into JSONL; plot_results.py draws histograms and CDFs for the report.</w:t>
+      </w:r>
+    </w:p>
+    <w:p>
+      <w:pPr>
+        <w:spacing w:before="90" w:after="90"/>
+        <w:rPr>
+          <w:rFonts w:eastAsia="Times New Roman" w:cstheme="minorHAnsi"/>
+          <w:kern w:val="0"/>
+          <w14:ligatures w14:val="none"/>
+        </w:rPr>
+      </w:pPr>
+    </w:p>
+    <w:p>
+      <w:pPr>
+        <w:spacing w:before="90" w:after="90"/>
+        <w:rPr>
+          <w:rFonts w:eastAsia="Times New Roman" w:cstheme="minorHAnsi"/>
+          <w:kern w:val="0"/>
+          <w14:ligatures w14:val="none"/>
+        </w:rPr>
+      </w:pPr>
+    </w:p>
+    <w:p>
+      <w:pPr>
         <w:spacing w:before="100" w:beforeAutospacing="1" w:after="100" w:afterAutospacing="1"/>
-        <w:rPr>
-          <w:rFonts w:eastAsia="Times New Roman" w:cstheme="minorHAnsi"/>
-          <w:kern w:val="0"/>
-          <w14:ligatures w14:val="none"/>
-        </w:rPr>
-      </w:pPr>
-      <w:r>
-        <w:rPr>
-          <w:rFonts w:eastAsia="Times New Roman" w:cstheme="minorHAnsi"/>
-          <w:kern w:val="0"/>
-          <w14:ligatures w14:val="none"/>
-        </w:rPr>
-        <w:t>Start from </w:t>
-      </w:r>
-      <w:proofErr w:type="spellStart"/>
-      <w:r>
-        <w:rPr>
-          <w:rFonts w:eastAsia="Times New Roman" w:cstheme="minorHAnsi"/>
-          <w:kern w:val="0"/>
-          <w14:ligatures w14:val="none"/>
-        </w:rPr>
-        <w:t>main.go</w:t>
-      </w:r>
-      <w:proofErr w:type="spellEnd"/>
-      <w:r>
-        <w:rPr>
-          <w:rFonts w:eastAsia="Times New Roman" w:cstheme="minorHAnsi"/>
-          <w:kern w:val="0"/>
-          <w14:ligatures w14:val="none"/>
-        </w:rPr>
-        <w:t>: </w:t>
-      </w:r>
-      <w:proofErr w:type="spellStart"/>
-      <w:r>
-        <w:rPr>
-          <w:rFonts w:eastAsia="Times New Roman" w:cstheme="minorHAnsi"/>
-          <w:kern w:val="0"/>
-          <w14:ligatures w14:val="none"/>
-        </w:rPr>
-        <w:t>handleSet</w:t>
-      </w:r>
-      <w:proofErr w:type="spellEnd"/>
-      <w:r>
-        <w:rPr>
-          <w:rFonts w:eastAsia="Times New Roman" w:cstheme="minorHAnsi"/>
-          <w:kern w:val="0"/>
-          <w14:ligatures w14:val="none"/>
-        </w:rPr>
-        <w:t> / </w:t>
-      </w:r>
-      <w:proofErr w:type="spellStart"/>
-      <w:r>
-        <w:rPr>
-          <w:rFonts w:eastAsia="Times New Roman" w:cstheme="minorHAnsi"/>
-          <w:kern w:val="0"/>
-          <w14:ligatures w14:val="none"/>
-        </w:rPr>
-        <w:t>handleGet</w:t>
-      </w:r>
-      <w:proofErr w:type="spellEnd"/>
-      <w:r>
-        <w:rPr>
-          <w:rFonts w:eastAsia="Times New Roman" w:cstheme="minorHAnsi"/>
-          <w:kern w:val="0"/>
-          <w14:ligatures w14:val="none"/>
-        </w:rPr>
-        <w:t> branch on role, then on W or R inside the leader path. Replication is always </w:t>
-      </w:r>
-      <w:proofErr w:type="spellStart"/>
-      <w:r>
-        <w:rPr>
-          <w:rFonts w:eastAsia="Times New Roman" w:cstheme="minorHAnsi"/>
-          <w:kern w:val="0"/>
-          <w14:ligatures w14:val="none"/>
-        </w:rPr>
-        <w:t>postReplicate</w:t>
-      </w:r>
-      <w:proofErr w:type="spellEnd"/>
-      <w:r>
-        <w:rPr>
-          <w:rFonts w:eastAsia="Times New Roman" w:cstheme="minorHAnsi"/>
-          <w:kern w:val="0"/>
-          <w14:ligatures w14:val="none"/>
-        </w:rPr>
-        <w:t> → /internal/replicate.</w:t>
-      </w:r>
-    </w:p>
-    <w:p>
-      <w:pPr>
-        <w:numPr>
-          <w:ilvl w:val="0"/>
-          <w:numId w:val="3"/>
-        </w:numPr>
-        <w:spacing w:before="100" w:beforeAutospacing="1" w:after="100" w:afterAutospacing="1"/>
-        <w:rPr>
-          <w:rFonts w:eastAsia="Times New Roman" w:cstheme="minorHAnsi"/>
-          <w:kern w:val="0"/>
-          <w14:ligatures w14:val="none"/>
-        </w:rPr>
-      </w:pPr>
-      <w:r>
-        <w:rPr>
-          <w:rFonts w:eastAsia="Times New Roman" w:cstheme="minorHAnsi"/>
-          <w:kern w:val="0"/>
-          <w14:ligatures w14:val="none"/>
-        </w:rPr>
-        <w:t>Never deploy leaderless without KV_ALL_URLS and KV_SELF_URL set consistently on every container.</w:t>
-      </w:r>
-    </w:p>
-    <w:p>
-      <w:pPr>
-        <w:numPr>
-          <w:ilvl w:val="0"/>
-          <w:numId w:val="3"/>
-        </w:numPr>
-        <w:spacing w:before="100" w:beforeAutospacing="1" w:after="100" w:afterAutospacing="1"/>
-        <w:rPr>
-          <w:rFonts w:eastAsia="Times New Roman" w:cstheme="minorHAnsi"/>
-          <w:kern w:val="0"/>
-          <w14:ligatures w14:val="none"/>
-        </w:rPr>
-      </w:pPr>
-      <w:r>
-        <w:rPr>
-          <w:rFonts w:eastAsia="Times New Roman" w:cstheme="minorHAnsi"/>
-          <w:kern w:val="0"/>
-          <w14:ligatures w14:val="none"/>
-        </w:rPr>
-        <w:t>If behavior looks “wrong,” check /config on each node first—wrong R/W or missing URLs are the usual bug.</w:t>
-      </w:r>
-    </w:p>
-    <w:p>
-      <w:pPr>
-        <w:numPr>
-          <w:ilvl w:val="0"/>
-          <w:numId w:val="3"/>
-        </w:numPr>
-        <w:spacing w:before="100" w:beforeAutospacing="1" w:after="100" w:afterAutospacing="1"/>
-        <w:rPr>
-          <w:rFonts w:eastAsia="Times New Roman" w:cstheme="minorHAnsi"/>
-          <w:kern w:val="0"/>
-          <w14:ligatures w14:val="none"/>
-        </w:rPr>
-      </w:pPr>
-      <w:r>
-        <w:rPr>
-          <w:rFonts w:eastAsia="Times New Roman" w:cstheme="minorHAnsi"/>
-          <w:kern w:val="0"/>
-          <w14:ligatures w14:val="none"/>
-        </w:rPr>
-        <w:t>For class demos, Docker Compose pins host ports for the leader and followers so the Python client can reach them; on AWS you must fill the same variables with reachable URLs (public IPs or service discovery).</w:t>
-      </w:r>
-    </w:p>
-    <w:p>
-      <w:pPr>
-        <w:numPr>
-          <w:ilvl w:val="0"/>
-          <w:numId w:val="3"/>
-        </w:numPr>
-        <w:spacing w:before="100" w:beforeAutospacing="1" w:after="100" w:afterAutospacing="1"/>
-        <w:rPr>
-          <w:rFonts w:eastAsia="Times New Roman" w:cstheme="minorHAnsi"/>
-          <w:kern w:val="0"/>
-          <w14:ligatures w14:val="none"/>
-        </w:rPr>
-      </w:pPr>
-      <w:r>
-        <w:rPr>
-          <w:rFonts w:eastAsia="Times New Roman" w:cstheme="minorHAnsi"/>
-          <w:kern w:val="0"/>
-          <w14:ligatures w14:val="none"/>
-        </w:rPr>
-        <w:t xml:space="preserve">When you change replication logic, re-run go </w:t>
-      </w:r>
-      <w:proofErr w:type="spellStart"/>
-      <w:r>
-        <w:rPr>
-          <w:rFonts w:eastAsia="Times New Roman" w:cstheme="minorHAnsi"/>
-          <w:kern w:val="0"/>
-          <w14:ligatures w14:val="none"/>
-        </w:rPr>
-        <w:t>test</w:t>
-      </w:r>
-      <w:proofErr w:type="spellEnd"/>
-      <w:r>
-        <w:rPr>
-          <w:rFonts w:eastAsia="Times New Roman" w:cstheme="minorHAnsi"/>
-          <w:kern w:val="0"/>
-          <w14:ligatures w14:val="none"/>
-        </w:rPr>
-        <w:t xml:space="preserve"> ./... and one manual docker compose + curl smoke test before trusting load-test numbers.</w:t>
-      </w:r>
+        <w:ind w:left="720"/>
+        <w:rPr>
+          <w:rFonts w:eastAsia="Times New Roman" w:cstheme="minorHAnsi"/>
+          <w:kern w:val="0"/>
+          <w14:ligatures w14:val="none"/>
+        </w:rPr>
+      </w:pPr>
     </w:p>
     <w:sectPr>
       <w:pgSz w:w="12240" w:h="15840"/>
@@ -2502,7 +2922,6 @@
     <w:name w:val="Normal (Web)"/>
     <w:basedOn w:val="Normal"/>
     <w:uiPriority w:val="99"/>
-    <w:semiHidden/>
     <w:unhideWhenUsed/>
     <w:rsid w:val="0031698B"/>
     <w:pPr>

</xml_diff>